<commit_message>
Corrige marcação no Word do contrato rede
Co-Authored-By: Claude Opus 5.5 <noreply@anthropic.com>
Claude-Session: https://claude.ai/code/session_01GBgE5oQHk88JmK3Cciwnvx
</commit_message>
<xml_diff>
--- a/alignsystem/docs/revisao-juridica/Contrato_Paciente_Rede_AlignSystem_REVISAO.docx
+++ b/alignsystem/docs/revisao-juridica/Contrato_Paciente_Rede_AlignSystem_REVISAO.docx
@@ -817,10 +817,10 @@
         <w:jc w:val="both"/>
       </w:pPr>
       <w:r>
-        <w:t xml:space="preserve">i&gt;Redação alternativa da 10.3, usada automaticamente quando o dentista credenciado mais próximo está a mais de 300 km:</w:t>
-      </w:r>
-      <w:r>
-        <w:t xml:space="preserve">/i&gt;</w:t>
+        <w:rPr>
+          <w:highlight w:val="yellow"/>
+        </w:rPr>
+        <w:t xml:space="preserve">[Redação alternativa da 10.3, usada automaticamente quando o dentista credenciado mais próximo está a mais de 300 km:]</w:t>
       </w:r>
     </w:p>
     <w:p>

</xml_diff>